<commit_message>
docs(presentation): explicitly highlight GroqProvider and MockProvider in Part 1 opening pitch
</commit_message>
<xml_diff>
--- a/PO_Backlog_Architect_Demo_Presentation_Script.docx
+++ b/PO_Backlog_Architect_Demo_Presentation_Script.docx
@@ -168,9 +168,9 @@
                 <w:color w:val="282828"/>
                 <w:sz w:val="20"/>
               </w:rPr>
-              <w:t>1. Start on Streamlit UI homepage (http://localhost:8501). Point out sidebar configuration: Groq (qwen/qwen3.6-27b) and active safeguards.</w:t>
+              <w:t>1. Start on Streamlit UI homepage (http://localhost:8501). Point out sidebar dropdown: toggle between 'Groq (qwen/qwen3.6-27b)' and 'Mock (Deterministic)', and show active safeguards.</w:t>
               <w:br/>
-              <w:t>2. Switch VS Code window to README.md lines 212-235 (Architecture ASCII Diagram).</w:t>
+              <w:t>2. Switch VS Code window to README.md lines 212-235 (Architecture ASCII Diagram showing LLMProvider interface).</w:t>
               <w:br/>
               <w:br/>
             </w:r>
@@ -191,7 +191,13 @@
                 <w:color w:val="1E1E1E"/>
                 <w:sz w:val="19"/>
               </w:rPr>
-              <w:t>README.md: L212 - L235 (Architecture Component Boundaries Diagram)</w:t>
+              <w:t>• README.md: L212 - L235 (Architecture Component Boundaries Diagram)</w:t>
+              <w:br/>
+              <w:t>• LLM Provider Base: app/llm/base.py: L1 - L30 (LLMProvider protocol)</w:t>
+              <w:br/>
+              <w:t>• Groq Live Provider: app/llm/groq_provider.py: L1 - L85 (qwen/qwen3.6-27b model)</w:t>
+              <w:br/>
+              <w:t>• Mock Offline Provider: app/llm/mock_provider.py: L1 - L75 (deterministic response mock)</w:t>
               <w:br/>
               <w:br/>
             </w:r>
@@ -212,7 +218,7 @@
                 <w:color w:val="141414"/>
                 <w:sz w:val="21"/>
               </w:rPr>
-              <w:t>"Hello everyone! Today I'm presenting the PO Backlog Architect Agent for FlowDesk. When engineering teams try using LLMs to generate user stories and acceptance criteria, three major failure modes occur: First, hallucinated technical requirements—like an AI inventing a 50 MB file size limit when the specification has no exact number. Second, generic story proliferation—vague user stories like 'As a user, I want to manage data efficiently' that fail Definition of Ready. And third, uncontrolled external writes—where an LLM pushes unreviewed items directly into Jira or Azure DevOps as READY. Our core design philosophy is GOVERNANCE OVER GENERATION. The LLM proposes artifacts, but deterministic Python service code validates section-level citations, scores anti-generic specificity across 3 layers, evaluates Definition of Ready rules, and enforces a structural human approval gate with an immutable NOT_READY status floor."</w:t>
+              <w:t>"Hello everyone! Today I'm presenting the PO Backlog Architect Agent for FlowDesk. Notice in our Streamlit sidebar that we support two LLM providers via our abstract LLMProvider protocol: GroqProvider using open-weights model qwen/qwen3.6-27b for live AI inference, and MockProvider for fast, 0.05-second deterministic offline testing. When engineering teams try using LLMs to generate user stories and acceptance criteria, three major failure modes occur: First, hallucinated technical requirements—like an AI inventing a 50 MB file size limit when the specification has no exact number. Second, generic story proliferation—vague user stories like 'As a user, I want to manage data efficiently' that fail Definition of Ready. And third, uncontrolled external writes—where an LLM pushes unreviewed items directly into Jira or Azure DevOps as READY. Our core design philosophy is GOVERNANCE OVER GENERATION. The LLM proposes artifacts, but deterministic Python service code validates section-level citations, scores anti-generic specificity across 3 layers, evaluates Definition of Ready rules, and enforces a structural human approval gate with an immutable NOT_READY status floor."</w:t>
               <w:br/>
             </w:r>
           </w:p>

</xml_diff>

<commit_message>
docs(presentation): embed inline visual and code cues directly inside spoken presentation lyrics
</commit_message>
<xml_diff>
--- a/PO_Backlog_Architect_Demo_Presentation_Script.docx
+++ b/PO_Backlog_Architect_Demo_Presentation_Script.docx
@@ -13,7 +13,7 @@
           <w:color w:val="102C57"/>
           <w:sz w:val="48"/>
         </w:rPr>
-        <w:t>PO Backlog Architect Agent — Word-for-Word Demo Script &amp; Visual Timeline</w:t>
+        <w:t>PO Backlog Architect Agent — Word-for-Word Presentation Script with Inline Screen &amp; Code Cues</w:t>
       </w:r>
     </w:p>
     <w:p>
@@ -27,7 +27,7 @@
           <w:color w:val="646464"/>
           <w:sz w:val="24"/>
         </w:rPr>
-        <w:t>Complete Minute-by-Minute Presentation Script ('Lyrics'), Visual Screen Actions, Code Line References, and Tab-by-Tab Demo Walkthrough for Digital T3 Submission</w:t>
+        <w:t>Complete Live Presentation Script ('Lyrics') with Integrated Screen Cues, VS Code Line References, and Embedded Screenshots for Digital T3 Submission</w:t>
       </w:r>
     </w:p>
     <w:p>
@@ -41,7 +41,7 @@
           <w:color w:val="1E1E1E"/>
           <w:sz w:val="21"/>
         </w:rPr>
-        <w:t xml:space="preserve">Presentation Setup Instructions: </w:t>
+        <w:t xml:space="preserve">Presentation Setup &amp; How to Use: </w:t>
       </w:r>
       <w:r>
         <w:rPr>
@@ -50,7 +50,7 @@
           <w:color w:val="282828"/>
           <w:sz w:val="21"/>
         </w:rPr>
-        <w:t>This document is your exact step-by-step script for delivering your live presentation and video demo to Digital T3. It contains what to say ('lyrics'), what to display on screen at every moment, exact VS Code line numbers, and embedded UI screenshots.</w:t>
+        <w:t>This document is your complete word-for-word presentation script. As you speak each sentence out loud, the inline bracketed tags tell you exactly what to show on screen [SHOW UI: ...], what file and line to display in VS Code [SHOW CODE: ...], or what button to click [ACTION: ...].</w:t>
       </w:r>
     </w:p>
     <w:p>
@@ -92,7 +92,7 @@
           <w:rFonts w:ascii="Calibri" w:hAnsi="Calibri"/>
           <w:sz w:val="20"/>
         </w:rPr>
-        <w:t>FastAPI Server running in Terminal 1 (uvicorn app.main:app --reload) and Streamlit running in Terminal 2 (streamlit run ui/dashboard.py).</w:t>
+        <w:t>Terminal 1 running uvicorn app.main:app --reload and Terminal 2 running streamlit run ui/dashboard.py.</w:t>
       </w:r>
     </w:p>
     <w:p>
@@ -156,70 +156,109 @@
               <w:rPr>
                 <w:rFonts w:ascii="Calibri" w:hAnsi="Calibri"/>
                 <w:b/>
-                <w:color w:val="1E56A0"/>
-                <w:sz w:val="20"/>
+                <w:color w:val="102C57"/>
+                <w:sz w:val="21"/>
               </w:rPr>
-              <w:t>🖥️ SCREEN ACTION / WHAT TO SHOW ON SCREEN:</w:t>
+              <w:t>🎙️ WORD-FOR-WORD SPOKEN SCRIPT WITH INLINE VISUAL &amp; CODE CUES:</w:t>
               <w:br/>
+            </w:r>
+          </w:p>
+          <w:p>
+            <w:pPr>
+              <w:spacing w:after="80" w:line="276" w:lineRule="auto"/>
+            </w:pPr>
+            <w:r>
+              <w:rPr>
+                <w:rFonts w:ascii="Calibri" w:hAnsi="Calibri"/>
+                <w:color w:val="1E1E1E"/>
+                <w:sz w:val="21"/>
+              </w:rPr>
+              <w:t xml:space="preserve">Hello everyone! Today I'm presenting the PO Backlog Architect Agent for FlowDesk. </w:t>
             </w:r>
             <w:r>
               <w:rPr>
                 <w:rFonts w:ascii="Calibri" w:hAnsi="Calibri"/>
-                <w:color w:val="282828"/>
-                <w:sz w:val="20"/>
+                <w:b/>
+                <w:color w:val="1E56A0"/>
+                <w:sz w:val="19"/>
               </w:rPr>
-              <w:t>1. Start on Streamlit UI homepage (http://localhost:8501). Point out sidebar dropdown: toggle between 'Groq (qwen/qwen3.6-27b)' and 'Mock (Deterministic)', and show active safeguards.</w:t>
-              <w:br/>
-              <w:t>2. Switch VS Code window to README.md lines 212-235 (Architecture ASCII Diagram showing LLMProvider interface).</w:t>
-              <w:br/>
-              <w:br/>
+              <w:t xml:space="preserve">[SHOW UI: Streamlit Sidebar at http://localhost:8501 - LLM Provider Selector &amp; Active Safeguards] </w:t>
+            </w:r>
+            <w:r>
+              <w:rPr>
+                <w:rFonts w:ascii="Calibri" w:hAnsi="Calibri"/>
+                <w:color w:val="1E1E1E"/>
+                <w:sz w:val="21"/>
+              </w:rPr>
+              <w:t xml:space="preserve"> Notice in our Streamlit sidebar that we support two LLM providers via our abstract LLMProvider protocol </w:t>
             </w:r>
             <w:r>
               <w:rPr>
                 <w:rFonts w:ascii="Calibri" w:hAnsi="Calibri"/>
                 <w:b/>
                 <w:color w:val="B43214"/>
-                <w:sz w:val="20"/>
+                <w:sz w:val="19"/>
               </w:rPr>
-              <w:t>📁 EXACT CODE FILE &amp; LINE NUMBERS TO SHOW IN VS CODE:</w:t>
-              <w:br/>
+              <w:t xml:space="preserve">[SHOW CODE: app/llm/base.py: L1 - L30 (LLMProvider abstract protocol)] </w:t>
+            </w:r>
+            <w:r>
+              <w:rPr>
+                <w:rFonts w:ascii="Calibri" w:hAnsi="Calibri"/>
+                <w:color w:val="1E1E1E"/>
+                <w:sz w:val="21"/>
+              </w:rPr>
+              <w:t xml:space="preserve">: GroqProvider using open-weights model qwen/qwen3.6-27b for live AI inference </w:t>
             </w:r>
             <w:r>
               <w:rPr>
                 <w:rFonts w:ascii="Calibri" w:hAnsi="Calibri"/>
                 <w:b/>
-                <w:color w:val="1E1E1E"/>
+                <w:color w:val="B43214"/>
                 <w:sz w:val="19"/>
               </w:rPr>
-              <w:t>• README.md: L212 - L235 (Architecture Component Boundaries Diagram)</w:t>
-              <w:br/>
-              <w:t>• LLM Provider Base: app/llm/base.py: L1 - L30 (LLMProvider protocol)</w:t>
-              <w:br/>
-              <w:t>• Groq Live Provider: app/llm/groq_provider.py: L1 - L85 (qwen/qwen3.6-27b model)</w:t>
-              <w:br/>
-              <w:t>• Mock Offline Provider: app/llm/mock_provider.py: L1 - L75 (deterministic response mock)</w:t>
-              <w:br/>
-              <w:br/>
+              <w:t xml:space="preserve">[SHOW CODE: app/llm/groq_provider.py: L1 - L85] </w:t>
+            </w:r>
+            <w:r>
+              <w:rPr>
+                <w:rFonts w:ascii="Calibri" w:hAnsi="Calibri"/>
+                <w:color w:val="1E1E1E"/>
+                <w:sz w:val="21"/>
+              </w:rPr>
+              <w:t xml:space="preserve">, and MockProvider for fast, 0.05-second deterministic offline testing </w:t>
             </w:r>
             <w:r>
               <w:rPr>
                 <w:rFonts w:ascii="Calibri" w:hAnsi="Calibri"/>
                 <w:b/>
-                <w:color w:val="102C57"/>
-                <w:sz w:val="21"/>
+                <w:color w:val="B43214"/>
+                <w:sz w:val="19"/>
               </w:rPr>
-              <w:t>🎙️ WORD-FOR-WORD SPOKEN SCRIPT ("LYRICS"):</w:t>
-              <w:br/>
+              <w:t xml:space="preserve">[SHOW CODE: app/llm/mock_provider.py: L1 - L75] </w:t>
             </w:r>
             <w:r>
               <w:rPr>
                 <w:rFonts w:ascii="Calibri" w:hAnsi="Calibri"/>
-                <w:i/>
-                <w:color w:val="141414"/>
+                <w:color w:val="1E1E1E"/>
                 <w:sz w:val="21"/>
               </w:rPr>
-              <w:t>"Hello everyone! Today I'm presenting the PO Backlog Architect Agent for FlowDesk. Notice in our Streamlit sidebar that we support two LLM providers via our abstract LLMProvider protocol: GroqProvider using open-weights model qwen/qwen3.6-27b for live AI inference, and MockProvider for fast, 0.05-second deterministic offline testing. When engineering teams try using LLMs to generate user stories and acceptance criteria, three major failure modes occur: First, hallucinated technical requirements—like an AI inventing a 50 MB file size limit when the specification has no exact number. Second, generic story proliferation—vague user stories like 'As a user, I want to manage data efficiently' that fail Definition of Ready. And third, uncontrolled external writes—where an LLM pushes unreviewed items directly into Jira or Azure DevOps as READY. Our core design philosophy is GOVERNANCE OVER GENERATION. The LLM proposes artifacts, but deterministic Python service code validates section-level citations, scores anti-generic specificity across 3 layers, evaluates Definition of Ready rules, and enforces a structural human approval gate with an immutable NOT_READY status floor."</w:t>
-              <w:br/>
+              <w:t xml:space="preserve">. When engineering teams try using LLMs to generate user stories and acceptance criteria, three major failure modes occur: First, hallucinated technical requirements—like an AI inventing a 50 MB file size limit when the specification has no exact number. Second, generic story proliferation—vague user stories like 'As a user, I want to manage data efficiently' that fail Definition of Ready. And third, uncontrolled external writes—where an LLM pushes unreviewed items directly into Jira or Azure DevOps as READY. Our core design philosophy is GOVERNANCE OVER GENERATION </w:t>
+            </w:r>
+            <w:r>
+              <w:rPr>
+                <w:rFonts w:ascii="Calibri" w:hAnsi="Calibri"/>
+                <w:b/>
+                <w:color w:val="B43214"/>
+                <w:sz w:val="19"/>
+              </w:rPr>
+              <w:t xml:space="preserve">[SHOW CODE: README.md: L212 - L235 (Architecture Component Boundaries Diagram)] </w:t>
+            </w:r>
+            <w:r>
+              <w:rPr>
+                <w:rFonts w:ascii="Calibri" w:hAnsi="Calibri"/>
+                <w:color w:val="1E1E1E"/>
+                <w:sz w:val="21"/>
+              </w:rPr>
+              <w:t>. The LLM proposes artifacts, but deterministic Python service code validates section-level citations, scores anti-generic specificity across 3 layers, evaluates Definition of Ready rules, and enforces a structural human approval gate with an immutable NOT_READY status floor.</w:t>
             </w:r>
           </w:p>
           <w:p>
@@ -331,74 +370,145 @@
               <w:rPr>
                 <w:rFonts w:ascii="Calibri" w:hAnsi="Calibri"/>
                 <w:b/>
-                <w:color w:val="1E56A0"/>
-                <w:sz w:val="20"/>
+                <w:color w:val="102C57"/>
+                <w:sz w:val="21"/>
               </w:rPr>
-              <w:t>🖥️ SCREEN ACTION / WHAT TO SHOW ON SCREEN:</w:t>
+              <w:t>🎙️ WORD-FOR-WORD SPOKEN SCRIPT WITH INLINE VISUAL &amp; CODE CUES:</w:t>
               <w:br/>
+            </w:r>
+          </w:p>
+          <w:p>
+            <w:pPr>
+              <w:spacing w:after="80" w:line="276" w:lineRule="auto"/>
+            </w:pPr>
+            <w:r>
+              <w:rPr>
+                <w:rFonts w:ascii="Calibri" w:hAnsi="Calibri"/>
+                <w:color w:val="1E1E1E"/>
+                <w:sz w:val="21"/>
+              </w:rPr>
+              <w:t xml:space="preserve">First, let's look at Context Indexing in Tab 1 </w:t>
             </w:r>
             <w:r>
               <w:rPr>
                 <w:rFonts w:ascii="Calibri" w:hAnsi="Calibri"/>
-                <w:color w:val="282828"/>
-                <w:sz w:val="20"/>
+                <w:b/>
+                <w:color w:val="1E56A0"/>
+                <w:sz w:val="19"/>
               </w:rPr>
-              <w:t>1. Click Streamlit Tab 1 (Context Search). Type 'file upload' in search bar, click 'Search Context'. Expand section card [PB-04.1].</w:t>
-              <w:br/>
-              <w:t>2. Click Streamlit Tab 2 (Epic Decomposer). Select 'EP-001', click 'Decompose Epic'. Show generated stories.</w:t>
-              <w:br/>
-              <w:t>3. Select 'EP-002' (Thin Epic), click 'Decompose Epic'. Point out the red warning banner and Open Questions surfaced.</w:t>
-              <w:br/>
-              <w:br/>
+              <w:t xml:space="preserve">[SHOW UI: Streamlit Tab 1 - Context Search (O1)] </w:t>
+            </w:r>
+            <w:r>
+              <w:rPr>
+                <w:rFonts w:ascii="Calibri" w:hAnsi="Calibri"/>
+                <w:color w:val="1E1E1E"/>
+                <w:sz w:val="21"/>
+              </w:rPr>
+              <w:t xml:space="preserve">. We parse the FlowDesk product brief into 15 addressable sections, indexed with SQLite FTS5 </w:t>
             </w:r>
             <w:r>
               <w:rPr>
                 <w:rFonts w:ascii="Calibri" w:hAnsi="Calibri"/>
                 <w:b/>
                 <w:color w:val="B43214"/>
-                <w:sz w:val="20"/>
+                <w:sz w:val="19"/>
               </w:rPr>
-              <w:t>📁 EXACT CODE FILE &amp; LINE NUMBERS TO SHOW IN VS CODE:</w:t>
-              <w:br/>
+              <w:t xml:space="preserve">[SHOW CODE: app/services/context_service.py: L15 - L65 (index_markdown_brief)] </w:t>
+            </w:r>
+            <w:r>
+              <w:rPr>
+                <w:rFonts w:ascii="Calibri" w:hAnsi="Calibri"/>
+                <w:color w:val="1E1E1E"/>
+                <w:sz w:val="21"/>
+              </w:rPr>
+              <w:t xml:space="preserve">. If I search 'file upload' </w:t>
             </w:r>
             <w:r>
               <w:rPr>
                 <w:rFonts w:ascii="Calibri" w:hAnsi="Calibri"/>
                 <w:b/>
-                <w:color w:val="1E1E1E"/>
+                <w:color w:val="007832"/>
                 <w:sz w:val="19"/>
               </w:rPr>
-              <w:t>• Context Indexer: app/services/context_service.py: L15 - L65 (index_markdown_brief)</w:t>
+              <w:t xml:space="preserve">[ACTION: Type 'file upload' into search box and click 'Search Context'] </w:t>
+            </w:r>
+            <w:r>
+              <w:rPr>
+                <w:rFonts w:ascii="Calibri" w:hAnsi="Calibri"/>
+                <w:color w:val="1E1E1E"/>
+                <w:sz w:val="21"/>
+              </w:rPr>
+              <w:t>, the engine retrieves section PB-04.1. This addressable indexing is what enables claim-level citation validation.</w:t>
               <w:br/>
-              <w:t>• Seed Epics: data/epics.json: L1 - L17 (EP-001 detailed vs EP-002 thin)</w:t>
-              <w:br/>
-              <w:t>• Decomposer Agent: app/agents/decomposition_agent.py: L20 - L80 (decompose_epic)</w:t>
-              <w:br/>
-              <w:br/>
+              <w:t xml:space="preserve">Now let me move to Tab 2: Epic Decomposition </w:t>
             </w:r>
             <w:r>
               <w:rPr>
                 <w:rFonts w:ascii="Calibri" w:hAnsi="Calibri"/>
                 <w:b/>
-                <w:color w:val="102C57"/>
-                <w:sz w:val="21"/>
+                <w:color w:val="1E56A0"/>
+                <w:sz w:val="19"/>
               </w:rPr>
-              <w:t>🎙️ WORD-FOR-WORD SPOKEN SCRIPT ("LYRICS"):</w:t>
-              <w:br/>
+              <w:t xml:space="preserve">[SHOW UI: Streamlit Tab 2 - Epic Decomposer (O2)] </w:t>
             </w:r>
             <w:r>
               <w:rPr>
                 <w:rFonts w:ascii="Calibri" w:hAnsi="Calibri"/>
-                <w:i/>
-                <w:color w:val="141414"/>
+                <w:color w:val="1E1E1E"/>
                 <w:sz w:val="21"/>
               </w:rPr>
-              <w:t>"First, let's look at Context Indexing in Tab 1. We parse the FlowDesk product brief into 15 addressable sections, indexed with SQLite FTS5. If I search 'file upload', the engine retrieves section PB-04.1. This addressable indexing is what enables claim-level citation validation.</w:t>
-              <w:br/>
-              <w:t>Now let's move to Tab 2: Epic Decomposition. If I select EP-001—a detailed document management epic—the agent generates structured stories with citations.</w:t>
-              <w:br/>
-              <w:t>However, look at EP-002—a thin, 6-word epic titled 'Automate Approval Overrides'. Instead of fabricating fake requirements, our decomposition agent detects that detail is missing and surfaces Open Questions to the Product Owner first, such as 'What role is authorized to perform overrides?'"</w:t>
-              <w:br/>
+              <w:t xml:space="preserve">. If I select EP-001—a detailed document management epic </w:t>
+            </w:r>
+            <w:r>
+              <w:rPr>
+                <w:rFonts w:ascii="Calibri" w:hAnsi="Calibri"/>
+                <w:b/>
+                <w:color w:val="B43214"/>
+                <w:sz w:val="19"/>
+              </w:rPr>
+              <w:t xml:space="preserve">[SHOW CODE: data/epics.json: L1 - L8 (EP-001 definition) and ACTION: Select 'EP-001' and click 'Decompose Epic'] </w:t>
+            </w:r>
+            <w:r>
+              <w:rPr>
+                <w:rFonts w:ascii="Calibri" w:hAnsi="Calibri"/>
+                <w:color w:val="1E1E1E"/>
+                <w:sz w:val="21"/>
+              </w:rPr>
+              <w:t xml:space="preserve">—the agent generates structured stories with citations </w:t>
+            </w:r>
+            <w:r>
+              <w:rPr>
+                <w:rFonts w:ascii="Calibri" w:hAnsi="Calibri"/>
+                <w:b/>
+                <w:color w:val="B43214"/>
+                <w:sz w:val="19"/>
+              </w:rPr>
+              <w:t xml:space="preserve">[SHOW CODE: app/agents/decomposition_agent.py: L20 - L80] </w:t>
+            </w:r>
+            <w:r>
+              <w:rPr>
+                <w:rFonts w:ascii="Calibri" w:hAnsi="Calibri"/>
+                <w:color w:val="1E1E1E"/>
+                <w:sz w:val="21"/>
+              </w:rPr>
+              <w:t xml:space="preserve">. However, look at EP-002—a thin, 6-word epic titled 'Automate Approval Overrides' </w:t>
+            </w:r>
+            <w:r>
+              <w:rPr>
+                <w:rFonts w:ascii="Calibri" w:hAnsi="Calibri"/>
+                <w:b/>
+                <w:color w:val="B43214"/>
+                <w:sz w:val="19"/>
+              </w:rPr>
+              <w:t xml:space="preserve">[SHOW CODE: data/epics.json: L9 - L16 (EP-002 thin epic) and ACTION: Select 'EP-002' and click 'Decompose Epic'] </w:t>
+            </w:r>
+            <w:r>
+              <w:rPr>
+                <w:rFonts w:ascii="Calibri" w:hAnsi="Calibri"/>
+                <w:color w:val="1E1E1E"/>
+                <w:sz w:val="21"/>
+              </w:rPr>
+              <w:t>. Instead of fabricating fake requirements, our decomposition agent detects that detail is missing and surfaces Open Questions to the Product Owner first, such as 'What role is authorized to perform overrides?'</w:t>
             </w:r>
           </w:p>
           <w:p>
@@ -510,74 +620,145 @@
               <w:rPr>
                 <w:rFonts w:ascii="Calibri" w:hAnsi="Calibri"/>
                 <w:b/>
-                <w:color w:val="1E56A0"/>
-                <w:sz w:val="20"/>
+                <w:color w:val="102C57"/>
+                <w:sz w:val="21"/>
               </w:rPr>
-              <w:t>🖥️ SCREEN ACTION / WHAT TO SHOW ON SCREEN:</w:t>
+              <w:t>🎙️ WORD-FOR-WORD SPOKEN SCRIPT WITH INLINE VISUAL &amp; CODE CUES:</w:t>
               <w:br/>
+            </w:r>
+          </w:p>
+          <w:p>
+            <w:pPr>
+              <w:spacing w:after="80" w:line="276" w:lineRule="auto"/>
+            </w:pPr>
+            <w:r>
+              <w:rPr>
+                <w:rFonts w:ascii="Calibri" w:hAnsi="Calibri"/>
+                <w:color w:val="1E1E1E"/>
+                <w:sz w:val="21"/>
+              </w:rPr>
+              <w:t xml:space="preserve">In Tab 3, we generate Given/When/Then acceptance criteria </w:t>
             </w:r>
             <w:r>
               <w:rPr>
                 <w:rFonts w:ascii="Calibri" w:hAnsi="Calibri"/>
-                <w:color w:val="282828"/>
-                <w:sz w:val="20"/>
+                <w:b/>
+                <w:color w:val="1E56A0"/>
+                <w:sz w:val="19"/>
               </w:rPr>
-              <w:t>1. Click Streamlit Tab 3 (Criteria Generator). Select story 'BL-001', click 'Generate Criteria'. Show GWT scenarios &amp; PB-04.1 citation.</w:t>
-              <w:br/>
-              <w:t>2. Scroll down to Anti-Generic Guard. Type 'Manage my data efficiently' in custom text box, click 'Evaluate Specificity'.</w:t>
-              <w:br/>
-              <w:t>3. Point out 3-layer diagnostic breakdown (GENERIC, Score 1) and the auto-rewritten story.</w:t>
-              <w:br/>
-              <w:br/>
+              <w:t xml:space="preserve">[SHOW UI: Streamlit Tab 3 - Criteria Generator (O3/O6/O8)] </w:t>
+            </w:r>
+            <w:r>
+              <w:rPr>
+                <w:rFonts w:ascii="Calibri" w:hAnsi="Calibri"/>
+                <w:color w:val="1E1E1E"/>
+                <w:sz w:val="21"/>
+              </w:rPr>
+              <w:t xml:space="preserve">. When I select story BL-001 </w:t>
+            </w:r>
+            <w:r>
+              <w:rPr>
+                <w:rFonts w:ascii="Calibri" w:hAnsi="Calibri"/>
+                <w:b/>
+                <w:color w:val="007832"/>
+                <w:sz w:val="19"/>
+              </w:rPr>
+              <w:t xml:space="preserve">[ACTION: Select story 'BL-001' and click 'Generate Criteria'] </w:t>
+            </w:r>
+            <w:r>
+              <w:rPr>
+                <w:rFonts w:ascii="Calibri" w:hAnsi="Calibri"/>
+                <w:color w:val="1E1E1E"/>
+                <w:sz w:val="21"/>
+              </w:rPr>
+              <w:t xml:space="preserve">, the agent produces testable GWT scenarios and attaches verified citation PB-04.1. Our CitationService </w:t>
             </w:r>
             <w:r>
               <w:rPr>
                 <w:rFonts w:ascii="Calibri" w:hAnsi="Calibri"/>
                 <w:b/>
                 <w:color w:val="B43214"/>
-                <w:sz w:val="20"/>
+                <w:sz w:val="19"/>
               </w:rPr>
-              <w:t>📁 EXACT CODE FILE &amp; LINE NUMBERS TO SHOW IN VS CODE:</w:t>
+              <w:t xml:space="preserve">[SHOW CODE: app/services/citation_service.py: L30 - L95] </w:t>
+            </w:r>
+            <w:r>
+              <w:rPr>
+                <w:rFonts w:ascii="Calibri" w:hAnsi="Calibri"/>
+                <w:color w:val="1E1E1E"/>
+                <w:sz w:val="21"/>
+              </w:rPr>
+              <w:t xml:space="preserve"> checks both existence and numeric term grounding.</w:t>
               <w:br/>
+              <w:t xml:space="preserve">Below, we have our 3-Layer Anti-Generic Guard </w:t>
             </w:r>
             <w:r>
               <w:rPr>
                 <w:rFonts w:ascii="Calibri" w:hAnsi="Calibri"/>
                 <w:b/>
-                <w:color w:val="1E1E1E"/>
+                <w:color w:val="1E56A0"/>
                 <w:sz w:val="19"/>
               </w:rPr>
-              <w:t>• Citation Service: app/services/citation_service.py: L30 - L95 (validate_citation_support &amp; numeric term check)</w:t>
-              <w:br/>
-              <w:t>• Generic Config: config/generic_guard.json: L1 - L35 (forbidden_phrases &amp; vague_verbs)</w:t>
-              <w:br/>
-              <w:t>• Generic Guard Service: app/services/generic_guard_service.py: L40 - L110 (evaluate_specificity &amp; rewrite)</w:t>
-              <w:br/>
-              <w:br/>
+              <w:t xml:space="preserve">[SHOW UI: Streamlit Tab 3 Lower Section] </w:t>
+            </w:r>
+            <w:r>
+              <w:rPr>
+                <w:rFonts w:ascii="Calibri" w:hAnsi="Calibri"/>
+                <w:color w:val="1E1E1E"/>
+                <w:sz w:val="21"/>
+              </w:rPr>
+              <w:t xml:space="preserve">. If someone inputs a vague requirement like 'Manage my data efficiently' </w:t>
             </w:r>
             <w:r>
               <w:rPr>
                 <w:rFonts w:ascii="Calibri" w:hAnsi="Calibri"/>
                 <w:b/>
-                <w:color w:val="102C57"/>
-                <w:sz w:val="21"/>
+                <w:color w:val="007832"/>
+                <w:sz w:val="19"/>
               </w:rPr>
-              <w:t>🎙️ WORD-FOR-WORD SPOKEN SCRIPT ("LYRICS"):</w:t>
-              <w:br/>
+              <w:t xml:space="preserve">[ACTION: Type 'Manage my data efficiently' in custom text box and click 'Evaluate Specificity'] </w:t>
             </w:r>
             <w:r>
               <w:rPr>
                 <w:rFonts w:ascii="Calibri" w:hAnsi="Calibri"/>
-                <w:i/>
-                <w:color w:val="141414"/>
+                <w:color w:val="1E1E1E"/>
                 <w:sz w:val="21"/>
               </w:rPr>
-              <w:t>"In Tab 3, we generate Given/When/Then acceptance criteria. When I select story BL-001, the agent produces testable GWT scenarios and attaches verified citation PB-04.1. Our CitationService checks both existence and numeric term grounding.</w:t>
-              <w:br/>
-              <w:t>Below, we have our 3-Layer Anti-Generic Guard. If someone inputs a vague requirement like 'Manage my data efficiently', our guard evaluates 3 layers: Layer 1 exact phrase match ('manage data'), Layer 2 vague verb regex ('manage'), and Layer 3 specificity score.</w:t>
-              <w:br/>
-              <w:t>It flags the story as GENERIC (Score = 1) and automatically rewrites it into a domain-specific user story with a measurable outcome."</w:t>
-              <w:br/>
+              <w:t xml:space="preserve">, our guard evaluates 3 layers: Layer 1 exact phrase match ('manage data'), Layer 2 vague verb regex ('manage') </w:t>
+            </w:r>
+            <w:r>
+              <w:rPr>
+                <w:rFonts w:ascii="Calibri" w:hAnsi="Calibri"/>
+                <w:b/>
+                <w:color w:val="B43214"/>
+                <w:sz w:val="19"/>
+              </w:rPr>
+              <w:t xml:space="preserve">[SHOW CODE: config/generic_guard.json: L1 - L35] </w:t>
+            </w:r>
+            <w:r>
+              <w:rPr>
+                <w:rFonts w:ascii="Calibri" w:hAnsi="Calibri"/>
+                <w:color w:val="1E1E1E"/>
+                <w:sz w:val="21"/>
+              </w:rPr>
+              <w:t xml:space="preserve">, and Layer 3 specificity score </w:t>
+            </w:r>
+            <w:r>
+              <w:rPr>
+                <w:rFonts w:ascii="Calibri" w:hAnsi="Calibri"/>
+                <w:b/>
+                <w:color w:val="B43214"/>
+                <w:sz w:val="19"/>
+              </w:rPr>
+              <w:t xml:space="preserve">[SHOW CODE: app/services/generic_guard_service.py: L40 - L110] </w:t>
+            </w:r>
+            <w:r>
+              <w:rPr>
+                <w:rFonts w:ascii="Calibri" w:hAnsi="Calibri"/>
+                <w:color w:val="1E1E1E"/>
+                <w:sz w:val="21"/>
+              </w:rPr>
+              <w:t>. It flags the story as GENERIC (Score = 1) and automatically rewrites it into a domain-specific user story with a measurable outcome.</w:t>
             </w:r>
           </w:p>
           <w:p>
@@ -689,76 +870,198 @@
               <w:rPr>
                 <w:rFonts w:ascii="Calibri" w:hAnsi="Calibri"/>
                 <w:b/>
-                <w:color w:val="1E56A0"/>
-                <w:sz w:val="20"/>
+                <w:color w:val="102C57"/>
+                <w:sz w:val="21"/>
               </w:rPr>
-              <w:t>🖥️ SCREEN ACTION / WHAT TO SHOW ON SCREEN:</w:t>
+              <w:t>🎙️ WORD-FOR-WORD SPOKEN SCRIPT WITH INLINE VISUAL &amp; CODE CUES:</w:t>
               <w:br/>
+            </w:r>
+          </w:p>
+          <w:p>
+            <w:pPr>
+              <w:spacing w:after="80" w:line="276" w:lineRule="auto"/>
+            </w:pPr>
+            <w:r>
+              <w:rPr>
+                <w:rFonts w:ascii="Calibri" w:hAnsi="Calibri"/>
+                <w:color w:val="1E1E1E"/>
+                <w:sz w:val="21"/>
+              </w:rPr>
+              <w:t xml:space="preserve">In Tab 4, we evaluate the Definition of Ready </w:t>
             </w:r>
             <w:r>
               <w:rPr>
                 <w:rFonts w:ascii="Calibri" w:hAnsi="Calibri"/>
-                <w:color w:val="282828"/>
-                <w:sz w:val="20"/>
+                <w:b/>
+                <w:color w:val="1E56A0"/>
+                <w:sz w:val="19"/>
               </w:rPr>
-              <w:t>1. Click Streamlit Tab 4 (Readiness Gate). Select 'BL-003', click 'Evaluate Readiness' -&gt; Show BLOCKED. Select 'BL-005' -&gt; Show READY.</w:t>
-              <w:br/>
-              <w:t>2. Click Streamlit Tab 5 (Prioritization). Click 'Run Prioritization Engine' -&gt; Show sorted priority table &amp; formula breakdown.</w:t>
-              <w:br/>
-              <w:t>3. Click Streamlit Tab 6 (Overlap Detector). Select 'BL-006', click 'Check Overlap' -&gt; Show SUBSET match with BL-001.</w:t>
-              <w:br/>
-              <w:br/>
+              <w:t xml:space="preserve">[SHOW UI: Streamlit Tab 4 - Readiness Gate (O4)] </w:t>
+            </w:r>
+            <w:r>
+              <w:rPr>
+                <w:rFonts w:ascii="Calibri" w:hAnsi="Calibri"/>
+                <w:color w:val="1E1E1E"/>
+                <w:sz w:val="21"/>
+              </w:rPr>
+              <w:t xml:space="preserve">. Selecting BL-003 </w:t>
+            </w:r>
+            <w:r>
+              <w:rPr>
+                <w:rFonts w:ascii="Calibri" w:hAnsi="Calibri"/>
+                <w:b/>
+                <w:color w:val="007832"/>
+                <w:sz w:val="19"/>
+              </w:rPr>
+              <w:t xml:space="preserve">[ACTION: Select 'BL-003' and click 'Evaluate Readiness'] </w:t>
+            </w:r>
+            <w:r>
+              <w:rPr>
+                <w:rFonts w:ascii="Calibri" w:hAnsi="Calibri"/>
+                <w:color w:val="1E1E1E"/>
+                <w:sz w:val="21"/>
+              </w:rPr>
+              <w:t xml:space="preserve">—which lacks acceptance criteria—fails rule check 'has_acceptance_criteria' </w:t>
             </w:r>
             <w:r>
               <w:rPr>
                 <w:rFonts w:ascii="Calibri" w:hAnsi="Calibri"/>
                 <w:b/>
                 <w:color w:val="B43214"/>
-                <w:sz w:val="20"/>
+                <w:sz w:val="19"/>
               </w:rPr>
-              <w:t>📁 EXACT CODE FILE &amp; LINE NUMBERS TO SHOW IN VS CODE:</w:t>
-              <w:br/>
+              <w:t xml:space="preserve">[SHOW CODE: config/readiness.yaml: L1 - L32 and app/services/readiness_service.py: L25 - L75] </w:t>
+            </w:r>
+            <w:r>
+              <w:rPr>
+                <w:rFonts w:ascii="Calibri" w:hAnsi="Calibri"/>
+                <w:color w:val="1E1E1E"/>
+                <w:sz w:val="21"/>
+              </w:rPr>
+              <w:t xml:space="preserve"> and returns status BLOCKED. Selecting BL-005 </w:t>
             </w:r>
             <w:r>
               <w:rPr>
                 <w:rFonts w:ascii="Calibri" w:hAnsi="Calibri"/>
                 <w:b/>
-                <w:color w:val="1E1E1E"/>
+                <w:color w:val="007832"/>
                 <w:sz w:val="19"/>
               </w:rPr>
-              <w:t>• Readiness YAML: config/readiness.yaml: L1 - L32 (6 active rules)</w:t>
+              <w:t xml:space="preserve">[ACTION: Select 'BL-005' and click 'Evaluate Readiness'] </w:t>
+            </w:r>
+            <w:r>
+              <w:rPr>
+                <w:rFonts w:ascii="Calibri" w:hAnsi="Calibri"/>
+                <w:color w:val="1E1E1E"/>
+                <w:sz w:val="21"/>
+              </w:rPr>
+              <w:t xml:space="preserve"> passes all 6 YAML rules and returns status READY.</w:t>
               <w:br/>
-              <w:t>• Readiness Service: app/services/readiness_service.py: L25 - L75 (evaluate_readiness)</w:t>
-              <w:br/>
-              <w:t>• Prioritization Service: app/services/prioritization_service.py: L30 - L80 (calculate_priority_score formula)</w:t>
-              <w:br/>
-              <w:t>• Overlap Service: app/services/overlap_service.py: L20 - L70 (check_overlap)</w:t>
-              <w:br/>
-              <w:br/>
+              <w:t xml:space="preserve">In Tab 5 </w:t>
             </w:r>
             <w:r>
               <w:rPr>
                 <w:rFonts w:ascii="Calibri" w:hAnsi="Calibri"/>
                 <w:b/>
-                <w:color w:val="102C57"/>
-                <w:sz w:val="21"/>
+                <w:color w:val="1E56A0"/>
+                <w:sz w:val="19"/>
               </w:rPr>
-              <w:t>🎙️ WORD-FOR-WORD SPOKEN SCRIPT ("LYRICS"):</w:t>
-              <w:br/>
+              <w:t xml:space="preserve">[SHOW UI: Streamlit Tab 5 - Prioritization Engine (O5)] </w:t>
             </w:r>
             <w:r>
               <w:rPr>
                 <w:rFonts w:ascii="Calibri" w:hAnsi="Calibri"/>
-                <w:i/>
-                <w:color w:val="141414"/>
+                <w:color w:val="1E1E1E"/>
                 <w:sz w:val="21"/>
               </w:rPr>
-              <w:t>"In Tab 4, we evaluate the Definition of Ready. Selecting BL-003—which lacks acceptance criteria—fails rule check 'has_acceptance_criteria' and returns status BLOCKED. Selecting BL-005 passes all 6 YAML rules and returns status READY.</w:t>
+              <w:t xml:space="preserve">, our Prioritization Engine </w:t>
+            </w:r>
+            <w:r>
+              <w:rPr>
+                <w:rFonts w:ascii="Calibri" w:hAnsi="Calibri"/>
+                <w:b/>
+                <w:color w:val="B43214"/>
+                <w:sz w:val="19"/>
+              </w:rPr>
+              <w:t xml:space="preserve">[SHOW CODE: app/services/prioritization_service.py: L30 - L80] </w:t>
+            </w:r>
+            <w:r>
+              <w:rPr>
+                <w:rFonts w:ascii="Calibri" w:hAnsi="Calibri"/>
+                <w:color w:val="1E1E1E"/>
+                <w:sz w:val="21"/>
+              </w:rPr>
+              <w:t xml:space="preserve"> calculates scores using a transparent mathematical formula combining Business Value, Urgency, Risk Reduction, Dependency Penalty, and Readiness Factor </w:t>
+            </w:r>
+            <w:r>
+              <w:rPr>
+                <w:rFonts w:ascii="Calibri" w:hAnsi="Calibri"/>
+                <w:b/>
+                <w:color w:val="007832"/>
+                <w:sz w:val="19"/>
+              </w:rPr>
+              <w:t xml:space="preserve">[ACTION: Click 'Run Prioritization Engine'] </w:t>
+            </w:r>
+            <w:r>
+              <w:rPr>
+                <w:rFonts w:ascii="Calibri" w:hAnsi="Calibri"/>
+                <w:color w:val="1E1E1E"/>
+                <w:sz w:val="21"/>
+              </w:rPr>
+              <w:t>. We don't ask the LLM for priority; we compute it deterministically.</w:t>
               <w:br/>
-              <w:t>In Tab 5, our Prioritization Engine calculates scores using a transparent mathematical formula combining Business Value, Urgency, Risk Reduction, Dependency Penalty, and Readiness Factor. We don't ask the LLM for priority; we compute it deterministically.</w:t>
-              <w:br/>
-              <w:t>In Tab 6, Overlap Detector checks new candidate story BL-006 against existing backlog stories and identifies it as a SUBSET of story BL-001 with 92% confidence, recommending a merge."</w:t>
-              <w:br/>
+              <w:t xml:space="preserve">In Tab 6 </w:t>
+            </w:r>
+            <w:r>
+              <w:rPr>
+                <w:rFonts w:ascii="Calibri" w:hAnsi="Calibri"/>
+                <w:b/>
+                <w:color w:val="1E56A0"/>
+                <w:sz w:val="19"/>
+              </w:rPr>
+              <w:t xml:space="preserve">[SHOW UI: Streamlit Tab 6 - Overlap Detector (O7)] </w:t>
+            </w:r>
+            <w:r>
+              <w:rPr>
+                <w:rFonts w:ascii="Calibri" w:hAnsi="Calibri"/>
+                <w:color w:val="1E1E1E"/>
+                <w:sz w:val="21"/>
+              </w:rPr>
+              <w:t xml:space="preserve">, Overlap Detector </w:t>
+            </w:r>
+            <w:r>
+              <w:rPr>
+                <w:rFonts w:ascii="Calibri" w:hAnsi="Calibri"/>
+                <w:b/>
+                <w:color w:val="B43214"/>
+                <w:sz w:val="19"/>
+              </w:rPr>
+              <w:t xml:space="preserve">[SHOW CODE: app/services/overlap_service.py: L20 - L70] </w:t>
+            </w:r>
+            <w:r>
+              <w:rPr>
+                <w:rFonts w:ascii="Calibri" w:hAnsi="Calibri"/>
+                <w:color w:val="1E1E1E"/>
+                <w:sz w:val="21"/>
+              </w:rPr>
+              <w:t xml:space="preserve"> checks new candidate story BL-006 </w:t>
+            </w:r>
+            <w:r>
+              <w:rPr>
+                <w:rFonts w:ascii="Calibri" w:hAnsi="Calibri"/>
+                <w:b/>
+                <w:color w:val="007832"/>
+                <w:sz w:val="19"/>
+              </w:rPr>
+              <w:t xml:space="preserve">[ACTION: Select 'BL-006' and click 'Check Overlap'] </w:t>
+            </w:r>
+            <w:r>
+              <w:rPr>
+                <w:rFonts w:ascii="Calibri" w:hAnsi="Calibri"/>
+                <w:color w:val="1E1E1E"/>
+                <w:sz w:val="21"/>
+              </w:rPr>
+              <w:t xml:space="preserve"> against existing backlog stories and identifies it as a SUBSET of story BL-001 with 92% confidence, recommending a merge.</w:t>
             </w:r>
           </w:p>
           <w:p>
@@ -870,76 +1173,132 @@
               <w:rPr>
                 <w:rFonts w:ascii="Calibri" w:hAnsi="Calibri"/>
                 <w:b/>
-                <w:color w:val="1E56A0"/>
-                <w:sz w:val="20"/>
+                <w:color w:val="102C57"/>
+                <w:sz w:val="21"/>
               </w:rPr>
-              <w:t>🖥️ SCREEN ACTION / WHAT TO SHOW ON SCREEN:</w:t>
+              <w:t>🎙️ WORD-FOR-WORD SPOKEN SCRIPT WITH INLINE VISUAL &amp; CODE CUES:</w:t>
               <w:br/>
+            </w:r>
+          </w:p>
+          <w:p>
+            <w:pPr>
+              <w:spacing w:after="80" w:line="276" w:lineRule="auto"/>
+            </w:pPr>
+            <w:r>
+              <w:rPr>
+                <w:rFonts w:ascii="Calibri" w:hAnsi="Calibri"/>
+                <w:color w:val="1E1E1E"/>
+                <w:sz w:val="21"/>
+              </w:rPr>
+              <w:t xml:space="preserve">Now for our core safety control in Tab 7: The Human Approval Gate and Status Floor </w:t>
             </w:r>
             <w:r>
               <w:rPr>
                 <w:rFonts w:ascii="Calibri" w:hAnsi="Calibri"/>
-                <w:color w:val="282828"/>
-                <w:sz w:val="20"/>
+                <w:b/>
+                <w:color w:val="1E56A0"/>
+                <w:sz w:val="19"/>
               </w:rPr>
-              <w:t>1. Click Streamlit Tab 7 (Approval Queue). Select draft 'DFT-001' (Status: PENDING).</w:t>
+              <w:t xml:space="preserve">[SHOW UI: Streamlit Tab 7 - Approval Queue (O9)] </w:t>
+            </w:r>
+            <w:r>
+              <w:rPr>
+                <w:rFonts w:ascii="Calibri" w:hAnsi="Calibri"/>
+                <w:color w:val="1E1E1E"/>
+                <w:sz w:val="21"/>
+              </w:rPr>
+              <w:t>.</w:t>
               <w:br/>
-              <w:t>2. FIRST CLICK: Click 'Write to Tracker' -&gt; Show red error banner 'HTTP 403 Forbidden'. Open VS Code app/services/approval_service.py line 72.</w:t>
-              <w:br/>
-              <w:t>3. SECOND CLICK: Click 'Approve Draft' -&gt; Show status badge update to APPROVED.</w:t>
-              <w:br/>
-              <w:t>4. THIRD CLICK: Click 'Write to Tracker' -&gt; Show HTTP 200 OK success banner and MockTracker item with status NOT_READY and tag AI-drafted.</w:t>
-              <w:br/>
-              <w:br/>
+              <w:t xml:space="preserve">Notice draft DFT-001 in the queue with status PENDING. If an external system or user attempts to write this unapproved draft directly to MockTracker, watch what happens when I click 'Write to Tracker' </w:t>
+            </w:r>
+            <w:r>
+              <w:rPr>
+                <w:rFonts w:ascii="Calibri" w:hAnsi="Calibri"/>
+                <w:b/>
+                <w:color w:val="007832"/>
+                <w:sz w:val="19"/>
+              </w:rPr>
+              <w:t xml:space="preserve">[ACTION 1: Click 'Write to Tracker' on PENDING draft] </w:t>
+            </w:r>
+            <w:r>
+              <w:rPr>
+                <w:rFonts w:ascii="Calibri" w:hAnsi="Calibri"/>
+                <w:color w:val="1E1E1E"/>
+                <w:sz w:val="21"/>
+              </w:rPr>
+              <w:t xml:space="preserve">: The service layer rejects the call and returns HTTP 403 Forbidden: Draft must be APPROVED </w:t>
             </w:r>
             <w:r>
               <w:rPr>
                 <w:rFonts w:ascii="Calibri" w:hAnsi="Calibri"/>
                 <w:b/>
                 <w:color w:val="B43214"/>
-                <w:sz w:val="20"/>
+                <w:sz w:val="19"/>
               </w:rPr>
-              <w:t>📁 EXACT CODE FILE &amp; LINE NUMBERS TO SHOW IN VS CODE:</w:t>
+              <w:t xml:space="preserve">[SHOW CODE: app/services/approval_service.py: L72 (if draft.status != ApprovalStatus.APPROVED: raise ApprovalRequiredError)] </w:t>
+            </w:r>
+            <w:r>
+              <w:rPr>
+                <w:rFonts w:ascii="Calibri" w:hAnsi="Calibri"/>
+                <w:color w:val="1E1E1E"/>
+                <w:sz w:val="21"/>
+              </w:rPr>
+              <w:t>.</w:t>
               <w:br/>
+              <w:t xml:space="preserve">Now, as the human Product Owner, I click 'Approve Draft' </w:t>
             </w:r>
             <w:r>
               <w:rPr>
                 <w:rFonts w:ascii="Calibri" w:hAnsi="Calibri"/>
                 <w:b/>
-                <w:color w:val="1E1E1E"/>
+                <w:color w:val="007832"/>
                 <w:sz w:val="19"/>
               </w:rPr>
-              <w:t>• Approval Service Gate: app/services/approval_service.py: L65 - L85 (line 72: if draft.status != ApprovalStatus.APPROVED: raise ApprovalRequiredError)</w:t>
+              <w:t xml:space="preserve">[ACTION 2: Click 'Approve Draft'] </w:t>
+            </w:r>
+            <w:r>
+              <w:rPr>
+                <w:rFonts w:ascii="Calibri" w:hAnsi="Calibri"/>
+                <w:color w:val="1E1E1E"/>
+                <w:sz w:val="21"/>
+              </w:rPr>
+              <w:t>. The status changes to APPROVED.</w:t>
               <w:br/>
-              <w:t>• Status Floor Override: app/services/approval_service.py: L90 - L115 (write_draft_to_tracker: forces status=NOT_READY, tags=['AI-drafted'])</w:t>
-              <w:br/>
-              <w:br/>
+              <w:t xml:space="preserve">Now I click 'Write to Tracker' again </w:t>
             </w:r>
             <w:r>
               <w:rPr>
                 <w:rFonts w:ascii="Calibri" w:hAnsi="Calibri"/>
                 <w:b/>
-                <w:color w:val="102C57"/>
-                <w:sz w:val="21"/>
+                <w:color w:val="007832"/>
+                <w:sz w:val="19"/>
               </w:rPr>
-              <w:t>🎙️ WORD-FOR-WORD SPOKEN SCRIPT ("LYRICS"):</w:t>
-              <w:br/>
+              <w:t xml:space="preserve">[ACTION 3: Click 'Write to Tracker'] </w:t>
             </w:r>
             <w:r>
               <w:rPr>
                 <w:rFonts w:ascii="Calibri" w:hAnsi="Calibri"/>
-                <w:i/>
-                <w:color w:val="141414"/>
+                <w:color w:val="1E1E1E"/>
                 <w:sz w:val="21"/>
               </w:rPr>
-              <w:t>"Now for our core safety control in Tab 7: The Human Approval Gate and Status Floor.</w:t>
-              <w:br/>
-              <w:t>Notice draft DFT-001 in the queue with status PENDING. If an external system or user attempts to write this unapproved draft directly to MockTracker, watch what happens when I click 'Write to Tracker': The service layer rejects the call and returns HTTP 403 Forbidden: Draft must be APPROVED.</w:t>
-              <w:br/>
-              <w:t>Now, as the human Product Owner, I click 'Approve Draft'. The status changes to APPROVED.</w:t>
-              <w:br/>
-              <w:t>Now I click 'Write to Tracker' again. The call succeeds with HTTP 200 OK. But look at MockTracker: Even though the draft was approved, the status is forcibly locked at NOT_READY and tagged 'AI-drafted'. This guarantees that no AI item enters a sprint without final human PO review."</w:t>
-              <w:br/>
+              <w:t xml:space="preserve">. The call succeeds with HTTP 200 OK. But look at MockTracker </w:t>
+            </w:r>
+            <w:r>
+              <w:rPr>
+                <w:rFonts w:ascii="Calibri" w:hAnsi="Calibri"/>
+                <w:b/>
+                <w:color w:val="B43214"/>
+                <w:sz w:val="19"/>
+              </w:rPr>
+              <w:t xml:space="preserve">[SHOW CODE: app/services/approval_service.py: L90 - L115 (write_draft_to_tracker forcing status=NOT_READY)] </w:t>
+            </w:r>
+            <w:r>
+              <w:rPr>
+                <w:rFonts w:ascii="Calibri" w:hAnsi="Calibri"/>
+                <w:color w:val="1E1E1E"/>
+                <w:sz w:val="21"/>
+              </w:rPr>
+              <w:t>: Even though the draft was approved, the status is forcibly locked at NOT_READY and tagged 'AI-drafted'. This guarantees that no AI item enters a sprint without final human PO review.</w:t>
             </w:r>
           </w:p>
           <w:p>
@@ -1051,78 +1410,98 @@
               <w:rPr>
                 <w:rFonts w:ascii="Calibri" w:hAnsi="Calibri"/>
                 <w:b/>
-                <w:color w:val="1E56A0"/>
-                <w:sz w:val="20"/>
+                <w:color w:val="102C57"/>
+                <w:sz w:val="21"/>
               </w:rPr>
-              <w:t>🖥️ SCREEN ACTION / WHAT TO SHOW ON SCREEN:</w:t>
+              <w:t>🎙️ WORD-FOR-WORD SPOKEN SCRIPT WITH INLINE VISUAL &amp; CODE CUES:</w:t>
               <w:br/>
             </w:r>
+          </w:p>
+          <w:p>
+            <w:pPr>
+              <w:spacing w:after="80" w:line="276" w:lineRule="auto"/>
+            </w:pPr>
             <w:r>
               <w:rPr>
                 <w:rFonts w:ascii="Calibri" w:hAnsi="Calibri"/>
-                <w:color w:val="282828"/>
-                <w:sz w:val="20"/>
+                <w:color w:val="1E1E1E"/>
+                <w:sz w:val="21"/>
               </w:rPr>
-              <w:t>1. Switch screen focus to Terminal window.</w:t>
-              <w:br/>
-              <w:t>2. Type: python -m eval.run --provider mock -&gt; Show 10/10 PASS output table.</w:t>
-              <w:br/>
-              <w:t>3. Type: python eval/compare.py -&gt; Show side-by-side Mock vs Groq benchmark report.</w:t>
-              <w:br/>
-              <w:t>4. Type: python eval/adversarial_run.py -&gt; Show 7/7 PASS output (pointing out ADV-01 numeric grounding rejection).</w:t>
-              <w:br/>
-              <w:br/>
+              <w:t xml:space="preserve">To prove our system is robust beyond UI demonstrations, we built an automated evaluation suite </w:t>
             </w:r>
             <w:r>
               <w:rPr>
                 <w:rFonts w:ascii="Calibri" w:hAnsi="Calibri"/>
                 <w:b/>
-                <w:color w:val="B43214"/>
-                <w:sz w:val="20"/>
+                <w:color w:val="1E56A0"/>
+                <w:sz w:val="19"/>
               </w:rPr>
-              <w:t>📁 EXACT CODE FILE &amp; LINE NUMBERS TO SHOW IN VS CODE:</w:t>
+              <w:t xml:space="preserve">[SHOW UI: Switch focus to Terminal window] </w:t>
+            </w:r>
+            <w:r>
+              <w:rPr>
+                <w:rFonts w:ascii="Calibri" w:hAnsi="Calibri"/>
+                <w:color w:val="1E1E1E"/>
+                <w:sz w:val="21"/>
+              </w:rPr>
+              <w:t>.</w:t>
               <w:br/>
+              <w:t xml:space="preserve">In Terminal, I run 'python -m eval.run --provider mock' </w:t>
             </w:r>
             <w:r>
               <w:rPr>
                 <w:rFonts w:ascii="Calibri" w:hAnsi="Calibri"/>
                 <w:b/>
-                <w:color w:val="1E1E1E"/>
+                <w:color w:val="007832"/>
                 <w:sz w:val="19"/>
               </w:rPr>
-              <w:t>• Golden Harness: eval/run.py: L20 - L100 (run_eval &amp; provider CLI)</w:t>
+              <w:t xml:space="preserve">[ACTION: Run 'python -m eval.run --provider mock' in Terminal and SHOW CODE: eval/run.py: L20 - L100] </w:t>
+            </w:r>
+            <w:r>
+              <w:rPr>
+                <w:rFonts w:ascii="Calibri" w:hAnsi="Calibri"/>
+                <w:color w:val="1E1E1E"/>
+                <w:sz w:val="21"/>
+              </w:rPr>
+              <w:t>—achieving 10/10 PASS across all Golden Cases in 0.05 seconds.</w:t>
               <w:br/>
-              <w:t>• Side-by-Side Reporter: eval/compare.py: L10 - L60 (compare_results)</w:t>
-              <w:br/>
-              <w:t>• Adversarial Runner: eval/adversarial_run.py: L15 - L90 (run_adversarial_suite)</w:t>
-              <w:br/>
-              <w:br/>
+              <w:t xml:space="preserve">Next, running 'python eval/compare.py' </w:t>
             </w:r>
             <w:r>
               <w:rPr>
                 <w:rFonts w:ascii="Calibri" w:hAnsi="Calibri"/>
                 <w:b/>
-                <w:color w:val="102C57"/>
-                <w:sz w:val="21"/>
+                <w:color w:val="007832"/>
+                <w:sz w:val="19"/>
               </w:rPr>
-              <w:t>🎙️ WORD-FOR-WORD SPOKEN SCRIPT ("LYRICS"):</w:t>
-              <w:br/>
+              <w:t xml:space="preserve">[ACTION: Run 'python eval/compare.py' in Terminal and SHOW CODE: eval/compare.py: L10 - L60] </w:t>
             </w:r>
             <w:r>
               <w:rPr>
                 <w:rFonts w:ascii="Calibri" w:hAnsi="Calibri"/>
-                <w:i/>
-                <w:color w:val="141414"/>
+                <w:color w:val="1E1E1E"/>
                 <w:sz w:val="21"/>
               </w:rPr>
-              <w:t>"To prove our system is robust beyond UI demonstrations, we built an automated evaluation suite.</w:t>
+              <w:t xml:space="preserve"> benchmarks our deterministic Mock against live Groq LLM inference with qwen/qwen3.6-27b over 3 repeated runs. Groq achieves 10/10 PASS with 1.45-second average latency, zero retries, and zero schema failures.</w:t>
               <w:br/>
-              <w:t>In Terminal, I run 'python -m eval.run --provider mock'—achieving 10/10 PASS across all Golden Cases in 0.05 seconds.</w:t>
-              <w:br/>
-              <w:t>Next, running 'python eval/compare.py' benchmarks our deterministic Mock against live Groq LLM inference with qwen/qwen3.6-27b over 3 repeated runs. Groq achieves 10/10 PASS with 1.45-second average latency, zero retries, and zero schema failures.</w:t>
-              <w:br/>
-              <w:t>Finally, running 'python eval/adversarial_run.py' executes 7 adversarial probes—achieving 7/7 PASS. For example, ADV-01 injects a hallucinated '50 MB' file limit. CitationService detects that '50 MB' is not in PB-04.2 and rejects the claim."</w:t>
-              <w:br/>
+              <w:t xml:space="preserve">Finally, running 'python eval/adversarial_run.py' </w:t>
+            </w:r>
+            <w:r>
+              <w:rPr>
+                <w:rFonts w:ascii="Calibri" w:hAnsi="Calibri"/>
+                <w:b/>
+                <w:color w:val="007832"/>
+                <w:sz w:val="19"/>
+              </w:rPr>
+              <w:t xml:space="preserve">[ACTION: Run 'python eval/adversarial_run.py' in Terminal and SHOW CODE: eval/adversarial_run.py: L15 - L90] </w:t>
+            </w:r>
+            <w:r>
+              <w:rPr>
+                <w:rFonts w:ascii="Calibri" w:hAnsi="Calibri"/>
+                <w:color w:val="1E1E1E"/>
+                <w:sz w:val="21"/>
+              </w:rPr>
+              <w:t xml:space="preserve"> executes 7 adversarial probes—achieving 7/7 PASS. For example, ADV-01 injects a hallucinated '50 MB' file limit. CitationService detects that '50 MB' is not in PB-04.2 and rejects the claim.</w:t>
             </w:r>
           </w:p>
           <w:p>
@@ -1234,74 +1613,102 @@
               <w:rPr>
                 <w:rFonts w:ascii="Calibri" w:hAnsi="Calibri"/>
                 <w:b/>
-                <w:color w:val="1E56A0"/>
-                <w:sz w:val="20"/>
+                <w:color w:val="102C57"/>
+                <w:sz w:val="21"/>
               </w:rPr>
-              <w:t>🖥️ SCREEN ACTION / WHAT TO SHOW ON SCREEN:</w:t>
+              <w:t>🎙️ WORD-FOR-WORD SPOKEN SCRIPT WITH INLINE VISUAL &amp; CODE CUES:</w:t>
               <w:br/>
             </w:r>
+          </w:p>
+          <w:p>
+            <w:pPr>
+              <w:spacing w:after="80" w:line="276" w:lineRule="auto"/>
+            </w:pPr>
             <w:r>
               <w:rPr>
                 <w:rFonts w:ascii="Calibri" w:hAnsi="Calibri"/>
-                <w:color w:val="282828"/>
-                <w:sz w:val="20"/>
+                <w:color w:val="1E1E1E"/>
+                <w:sz w:val="21"/>
               </w:rPr>
-              <w:t>1. Switch VS Code window to docs/decision-log.md (ADR-002, ADR-004, ADR-006, ADR-008).</w:t>
+              <w:t>In conclusion, our project evolved from a feature prototype into a governed AI Product Owner system.</w:t>
               <w:br/>
-              <w:t>2. End presentation with full confidence.</w:t>
-              <w:br/>
-              <w:br/>
+              <w:t xml:space="preserve">We made three key architectural decisions documented in our ADR log </w:t>
             </w:r>
             <w:r>
               <w:rPr>
                 <w:rFonts w:ascii="Calibri" w:hAnsi="Calibri"/>
                 <w:b/>
                 <w:color w:val="B43214"/>
-                <w:sz w:val="20"/>
+                <w:sz w:val="19"/>
               </w:rPr>
-              <w:t>📁 EXACT CODE FILE &amp; LINE NUMBERS TO SHOW IN VS CODE:</w:t>
+              <w:t xml:space="preserve">[SHOW CODE: docs/decision-log.md: L1 - L150] </w:t>
+            </w:r>
+            <w:r>
+              <w:rPr>
+                <w:rFonts w:ascii="Calibri" w:hAnsi="Calibri"/>
+                <w:color w:val="1E1E1E"/>
+                <w:sz w:val="21"/>
+              </w:rPr>
+              <w:t>:</w:t>
               <w:br/>
+              <w:t xml:space="preserve">First, we chose SQLite FTS5 over Vector DBs </w:t>
             </w:r>
             <w:r>
               <w:rPr>
                 <w:rFonts w:ascii="Calibri" w:hAnsi="Calibri"/>
                 <w:b/>
-                <w:color w:val="1E1E1E"/>
+                <w:color w:val="B43214"/>
                 <w:sz w:val="19"/>
               </w:rPr>
-              <w:t>docs/decision-log.md: L1 - L150 (ADR-001 through ADR-008 Architecture Decision Records)</w:t>
+              <w:t xml:space="preserve">[SHOW CODE: docs/decision-log.md - ADR-002] </w:t>
+            </w:r>
+            <w:r>
+              <w:rPr>
+                <w:rFonts w:ascii="Calibri" w:hAnsi="Calibri"/>
+                <w:color w:val="1E1E1E"/>
+                <w:sz w:val="21"/>
+              </w:rPr>
+              <w:t xml:space="preserve"> because our product brief is structured into addressable sections (PB-01 to PB-15). FTS5 provides 100% deterministic lookup with zero vector infrastructure overhead.</w:t>
               <w:br/>
-              <w:br/>
+              <w:t xml:space="preserve">Second, we built MockProvider alongside GroqProvider </w:t>
             </w:r>
             <w:r>
               <w:rPr>
                 <w:rFonts w:ascii="Calibri" w:hAnsi="Calibri"/>
                 <w:b/>
-                <w:color w:val="102C57"/>
-                <w:sz w:val="21"/>
+                <w:color w:val="B43214"/>
+                <w:sz w:val="19"/>
               </w:rPr>
-              <w:t>🎙️ WORD-FOR-WORD SPOKEN SCRIPT ("LYRICS"):</w:t>
-              <w:br/>
+              <w:t xml:space="preserve">[SHOW CODE: docs/decision-log.md - ADR-004] </w:t>
             </w:r>
             <w:r>
               <w:rPr>
                 <w:rFonts w:ascii="Calibri" w:hAnsi="Calibri"/>
-                <w:i/>
-                <w:color w:val="141414"/>
+                <w:color w:val="1E1E1E"/>
                 <w:sz w:val="21"/>
               </w:rPr>
-              <w:t>"In conclusion, our project evolved from a feature prototype into a governed AI Product Owner system.</w:t>
+              <w:t xml:space="preserve"> to enable fast, reproducible CI regression testing.</w:t>
               <w:br/>
-              <w:t>We made three key architectural decisions documented in our ADR log:</w:t>
+              <w:t xml:space="preserve">And third, we enforced approval gating and status floors in Python service objects </w:t>
+            </w:r>
+            <w:r>
+              <w:rPr>
+                <w:rFonts w:ascii="Calibri" w:hAnsi="Calibri"/>
+                <w:b/>
+                <w:color w:val="B43214"/>
+                <w:sz w:val="19"/>
+              </w:rPr>
+              <w:t xml:space="preserve">[SHOW CODE: docs/decision-log.md - ADR-006 &amp; ADR-008] </w:t>
+            </w:r>
+            <w:r>
+              <w:rPr>
+                <w:rFonts w:ascii="Calibri" w:hAnsi="Calibri"/>
+                <w:color w:val="1E1E1E"/>
+                <w:sz w:val="21"/>
+              </w:rPr>
+              <w:t xml:space="preserve"> rather than complex graph frameworks, keeping the codebase clean, maintainable, and robust.</w:t>
               <w:br/>
-              <w:t>First, we chose SQLite FTS5 over Vector DBs because our product brief is structured into addressable sections (PB-01 to PB-15). FTS5 provides 100% deterministic lookup with zero vector infrastructure overhead.</w:t>
-              <w:br/>
-              <w:t>Second, we built MockProvider alongside GroqProvider to enable fast, reproducible CI regression testing.</w:t>
-              <w:br/>
-              <w:t>And third, we enforced approval gating and status floors in Python service objects rather than complex graph frameworks, keeping the codebase clean, maintainable, and robust.</w:t>
-              <w:br/>
-              <w:t>Thank you! I am now ready for any technical questions."</w:t>
-              <w:br/>
+              <w:t>Thank you! I am now ready for any technical questions.</w:t>
             </w:r>
           </w:p>
           <w:p>

</xml_diff>

<commit_message>
docs(presentation): add ID Naming Prefix Cheatsheet for BL, EP, PB, and DFT
</commit_message>
<xml_diff>
--- a/PO_Backlog_Architect_Demo_Presentation_Script.docx
+++ b/PO_Backlog_Architect_Demo_Presentation_Script.docx
@@ -93,6 +93,90 @@
           <w:sz w:val="20"/>
         </w:rPr>
         <w:t>Terminal 1 running uvicorn app.main:app --reload and Terminal 2 running streamlit run ui/dashboard.py.</w:t>
+      </w:r>
+    </w:p>
+    <w:p>
+      <w:pPr>
+        <w:pStyle w:val="ListBullet"/>
+        <w:spacing w:after="60" w:line="276" w:lineRule="auto"/>
+      </w:pPr>
+      <w:r>
+        <w:rPr>
+          <w:rFonts w:ascii="Calibri" w:hAnsi="Calibri"/>
+          <w:b/>
+          <w:sz w:val="20"/>
+        </w:rPr>
+        <w:t xml:space="preserve">📌 ID Naming Prefix Cheatsheet: </w:t>
+      </w:r>
+      <w:r>
+        <w:rPr>
+          <w:rFonts w:ascii="Calibri" w:hAnsi="Calibri"/>
+          <w:sz w:val="20"/>
+        </w:rPr>
+        <w:t>BL-001...BL-020 = Backlog Item / Story ID (from data/backlog.json)</w:t>
+      </w:r>
+    </w:p>
+    <w:p>
+      <w:pPr>
+        <w:pStyle w:val="ListBullet"/>
+        <w:spacing w:after="60" w:line="276" w:lineRule="auto"/>
+      </w:pPr>
+      <w:r>
+        <w:rPr>
+          <w:rFonts w:ascii="Calibri" w:hAnsi="Calibri"/>
+          <w:b/>
+          <w:sz w:val="20"/>
+        </w:rPr>
+        <w:t xml:space="preserve">  </w:t>
+      </w:r>
+      <w:r>
+        <w:rPr>
+          <w:rFonts w:ascii="Calibri" w:hAnsi="Calibri"/>
+          <w:sz w:val="20"/>
+        </w:rPr>
+        <w:t>EP-001...EP-002 = Epic ID (from data/epics.json)</w:t>
+      </w:r>
+    </w:p>
+    <w:p>
+      <w:pPr>
+        <w:pStyle w:val="ListBullet"/>
+        <w:spacing w:after="60" w:line="276" w:lineRule="auto"/>
+      </w:pPr>
+      <w:r>
+        <w:rPr>
+          <w:rFonts w:ascii="Calibri" w:hAnsi="Calibri"/>
+          <w:b/>
+          <w:sz w:val="20"/>
+        </w:rPr>
+        <w:t xml:space="preserve">  </w:t>
+      </w:r>
+      <w:r>
+        <w:rPr>
+          <w:rFonts w:ascii="Calibri" w:hAnsi="Calibri"/>
+          <w:sz w:val="20"/>
+        </w:rPr>
+        <w:t>PB-01...PB-15 = Product Brief Section Reference ID (from data/product_brief.md)</w:t>
+      </w:r>
+    </w:p>
+    <w:p>
+      <w:pPr>
+        <w:pStyle w:val="ListBullet"/>
+        <w:spacing w:after="60" w:line="276" w:lineRule="auto"/>
+      </w:pPr>
+      <w:r>
+        <w:rPr>
+          <w:rFonts w:ascii="Calibri" w:hAnsi="Calibri"/>
+          <w:b/>
+          <w:sz w:val="20"/>
+        </w:rPr>
+        <w:t xml:space="preserve">  </w:t>
+      </w:r>
+      <w:r>
+        <w:rPr>
+          <w:rFonts w:ascii="Calibri" w:hAnsi="Calibri"/>
+          <w:sz w:val="20"/>
+        </w:rPr>
+        <w:t>DFT-001...DFT-005 = Generated Draft ID in Approval Queue (from database/service layer)</w:t>
       </w:r>
     </w:p>
     <w:p>

</xml_diff>

<commit_message>
feat(ui): add interactive 3-Layer Anti-Generic Guard UI section to Tab 3 of Streamlit dashboard
</commit_message>
<xml_diff>
--- a/PO_Backlog_Architect_Demo_Presentation_Script.docx
+++ b/PO_Backlog_Architect_Demo_Presentation_Script.docx
@@ -853,7 +853,7 @@
             <w:r>
               <w:drawing>
                 <wp:inline xmlns:a="http://schemas.openxmlformats.org/drawingml/2006/main" xmlns:pic="http://schemas.openxmlformats.org/drawingml/2006/picture">
-                  <wp:extent cx="5486400" cy="2603182"/>
+                  <wp:extent cx="5486400" cy="2606040"/>
                   <wp:docPr id="3" name="Picture 3"/>
                   <wp:cNvGraphicFramePr>
                     <a:graphicFrameLocks noChangeAspect="1"/>
@@ -874,7 +874,7 @@
                         <pic:spPr>
                           <a:xfrm>
                             <a:off x="0" y="0"/>
-                            <a:ext cx="5486400" cy="2603182"/>
+                            <a:ext cx="5486400" cy="2606040"/>
                           </a:xfrm>
                           <a:prstGeom prst="rect"/>
                         </pic:spPr>

</xml_diff>

<commit_message>
fix(ui): seed all 20 backlog stories (BL-001 through BL-020) into SQLite DB for Tab 4 readiness dropdown
</commit_message>
<xml_diff>
--- a/PO_Backlog_Architect_Demo_Presentation_Script.docx
+++ b/PO_Backlog_Architect_Demo_Presentation_Script.docx
@@ -1156,7 +1156,7 @@
             <w:r>
               <w:drawing>
                 <wp:inline xmlns:a="http://schemas.openxmlformats.org/drawingml/2006/main" xmlns:pic="http://schemas.openxmlformats.org/drawingml/2006/picture">
-                  <wp:extent cx="5486400" cy="2603182"/>
+                  <wp:extent cx="5486400" cy="2606040"/>
                   <wp:docPr id="4" name="Picture 4"/>
                   <wp:cNvGraphicFramePr>
                     <a:graphicFrameLocks noChangeAspect="1"/>
@@ -1177,7 +1177,7 @@
                         <pic:spPr>
                           <a:xfrm>
                             <a:off x="0" y="0"/>
-                            <a:ext cx="5486400" cy="2603182"/>
+                            <a:ext cx="5486400" cy="2606040"/>
                           </a:xfrm>
                           <a:prstGeom prst="rect"/>
                         </pic:spPr>

</xml_diff>

<commit_message>
docs(presentation): update Part 4 script to note automatic page load prioritization in Tab 5
</commit_message>
<xml_diff>
--- a/PO_Backlog_Architect_Demo_Presentation_Script.docx
+++ b/PO_Backlog_Architect_Demo_Presentation_Script.docx
@@ -1058,7 +1058,7 @@
                 <w:color w:val="1E1E1E"/>
                 <w:sz w:val="21"/>
               </w:rPr>
-              <w:t xml:space="preserve">, our Prioritization Engine </w:t>
+              <w:t xml:space="preserve">, our Prioritization Engine automatically calculates scores on page load </w:t>
             </w:r>
             <w:r>
               <w:rPr>
@@ -1075,24 +1075,7 @@
                 <w:color w:val="1E1E1E"/>
                 <w:sz w:val="21"/>
               </w:rPr>
-              <w:t xml:space="preserve"> calculates scores using a transparent mathematical formula combining Business Value, Urgency, Risk Reduction, Dependency Penalty, and Readiness Factor </w:t>
-            </w:r>
-            <w:r>
-              <w:rPr>
-                <w:rFonts w:ascii="Calibri" w:hAnsi="Calibri"/>
-                <w:b/>
-                <w:color w:val="007832"/>
-                <w:sz w:val="19"/>
-              </w:rPr>
-              <w:t xml:space="preserve">[ACTION: Click 'Run Prioritization Engine'] </w:t>
-            </w:r>
-            <w:r>
-              <w:rPr>
-                <w:rFonts w:ascii="Calibri" w:hAnsi="Calibri"/>
-                <w:color w:val="1E1E1E"/>
-                <w:sz w:val="21"/>
-              </w:rPr>
-              <w:t>. We don't ask the LLM for priority; we compute it deterministically.</w:t>
+              <w:t xml:space="preserve"> using a transparent mathematical formula rendered right at the top—combining Business Value, Urgency, Risk Reduction, Strategic Alignment, Dependency Penalty, and Readiness Factor. We don't ask the LLM for priority; we compute it deterministically.</w:t>
               <w:br/>
               <w:t xml:space="preserve">In Tab 6 </w:t>
             </w:r>

</xml_diff>

<commit_message>
docs(presentation): update Tab 3 and Tab 6 script cues for pre-filled text input fields
</commit_message>
<xml_diff>
--- a/PO_Backlog_Architect_Demo_Presentation_Script.docx
+++ b/PO_Backlog_Architect_Demo_Presentation_Script.docx
@@ -738,7 +738,7 @@
                 <w:color w:val="1E1E1E"/>
                 <w:sz w:val="21"/>
               </w:rPr>
-              <w:t xml:space="preserve">. When I select story BL-001 </w:t>
+              <w:t xml:space="preserve">. The UI pre-fills candidate story BL-006—'Upload Supporting Documents to Request' </w:t>
             </w:r>
             <w:r>
               <w:rPr>
@@ -747,7 +747,7 @@
                 <w:color w:val="007832"/>
                 <w:sz w:val="19"/>
               </w:rPr>
-              <w:t xml:space="preserve">[ACTION: Select story 'BL-001' and click 'Generate Criteria'] </w:t>
+              <w:t xml:space="preserve">[ACTION: Review pre-filled Story Title &amp; Description, then click 'Generate Acceptance Criteria'] </w:t>
             </w:r>
             <w:r>
               <w:rPr>
@@ -755,7 +755,7 @@
                 <w:color w:val="1E1E1E"/>
                 <w:sz w:val="21"/>
               </w:rPr>
-              <w:t xml:space="preserve">, the agent produces testable GWT scenarios and attaches verified citation PB-04.1. Our CitationService </w:t>
+              <w:t xml:space="preserve">. When I click 'Generate Acceptance Criteria', the agent produces testable GWT scenarios and attaches verified citation PB-04.1. Our CitationService </w:t>
             </w:r>
             <w:r>
               <w:rPr>
@@ -800,7 +800,7 @@
                 <w:color w:val="007832"/>
                 <w:sz w:val="19"/>
               </w:rPr>
-              <w:t xml:space="preserve">[ACTION: Type 'Manage my data efficiently' in custom text box and click 'Evaluate Specificity'] </w:t>
+              <w:t xml:space="preserve">[ACTION: Type 'Manage my data efficiently' in custom text box and click 'Evaluate Specificity &amp; Rewrite'] </w:t>
             </w:r>
             <w:r>
               <w:rPr>
@@ -997,7 +997,7 @@
                 <w:color w:val="007832"/>
                 <w:sz w:val="19"/>
               </w:rPr>
-              <w:t xml:space="preserve">[ACTION: Select 'BL-003' and click 'Evaluate Readiness'] </w:t>
+              <w:t xml:space="preserve">[ACTION: Select 'BL-003: Quick Search Tickets' from dropdown and click 'Evaluate Readiness'] </w:t>
             </w:r>
             <w:r>
               <w:rPr>
@@ -1031,7 +1031,7 @@
                 <w:color w:val="007832"/>
                 <w:sz w:val="19"/>
               </w:rPr>
-              <w:t xml:space="preserve">[ACTION: Select 'BL-005' and click 'Evaluate Readiness'] </w:t>
+              <w:t xml:space="preserve">[ACTION: Select 'BL-005: Multi-File Attachment Processing' and click 'Evaluate Readiness'] </w:t>
             </w:r>
             <w:r>
               <w:rPr>
@@ -1111,7 +1111,7 @@
                 <w:color w:val="1E1E1E"/>
                 <w:sz w:val="21"/>
               </w:rPr>
-              <w:t xml:space="preserve"> checks new candidate story BL-006 </w:t>
+              <w:t xml:space="preserve"> checks candidate story BL-006 'Upload Supporting Documents' </w:t>
             </w:r>
             <w:r>
               <w:rPr>
@@ -1120,7 +1120,7 @@
                 <w:color w:val="007832"/>
                 <w:sz w:val="19"/>
               </w:rPr>
-              <w:t xml:space="preserve">[ACTION: Select 'BL-006' and click 'Check Overlap'] </w:t>
+              <w:t xml:space="preserve">[ACTION: Review pre-filled New Story Title &amp; Description, then click 'Check Backlog Overlap'] </w:t>
             </w:r>
             <w:r>
               <w:rPr>
@@ -1128,7 +1128,7 @@
                 <w:color w:val="1E1E1E"/>
                 <w:sz w:val="21"/>
               </w:rPr>
-              <w:t xml:space="preserve"> against existing backlog stories and identifies it as a SUBSET of story BL-001 with 92% confidence, recommending a merge.</w:t>
+              <w:t xml:space="preserve"> against existing backlog stories and identifies it as a SUBSET of story BL-001 with high confidence, recommending a merge.</w:t>
             </w:r>
           </w:p>
           <w:p>

</xml_diff>

<commit_message>
feat(ui): add story selectbox dropdowns to Tab 3 and Tab 6 for populating any backlog item (BL-001 through BL-020)
</commit_message>
<xml_diff>
--- a/PO_Backlog_Architect_Demo_Presentation_Script.docx
+++ b/PO_Backlog_Architect_Demo_Presentation_Script.docx
@@ -1786,7 +1786,7 @@
             <w:r>
               <w:drawing>
                 <wp:inline xmlns:a="http://schemas.openxmlformats.org/drawingml/2006/main" xmlns:pic="http://schemas.openxmlformats.org/drawingml/2006/picture">
-                  <wp:extent cx="5486400" cy="2603182"/>
+                  <wp:extent cx="5486400" cy="2606040"/>
                   <wp:docPr id="7" name="Picture 7"/>
                   <wp:cNvGraphicFramePr>
                     <a:graphicFrameLocks noChangeAspect="1"/>
@@ -1807,7 +1807,7 @@
                         <pic:spPr>
                           <a:xfrm>
                             <a:off x="0" y="0"/>
-                            <a:ext cx="5486400" cy="2603182"/>
+                            <a:ext cx="5486400" cy="2606040"/>
                           </a:xfrm>
                           <a:prstGeom prst="rect"/>
                         </pic:spPr>

</xml_diff>

<commit_message>
docs(presentation): update Tab 6 script to explain exact DUPLICATE result with 100% confidence for BL-006
</commit_message>
<xml_diff>
--- a/PO_Backlog_Architect_Demo_Presentation_Script.docx
+++ b/PO_Backlog_Architect_Demo_Presentation_Script.docx
@@ -1111,7 +1111,7 @@
                 <w:color w:val="1E1E1E"/>
                 <w:sz w:val="21"/>
               </w:rPr>
-              <w:t xml:space="preserve"> checks candidate story BL-006 'Upload Supporting Documents' </w:t>
+              <w:t xml:space="preserve"> checks candidate stories against existing backlog items. When I select candidate story BL-006 'Upload Supporting Documents' </w:t>
             </w:r>
             <w:r>
               <w:rPr>
@@ -1120,7 +1120,7 @@
                 <w:color w:val="007832"/>
                 <w:sz w:val="19"/>
               </w:rPr>
-              <w:t xml:space="preserve">[ACTION: Review pre-filled New Story Title &amp; Description, then click 'Check Backlog Overlap'] </w:t>
+              <w:t xml:space="preserve">[ACTION: Select 'BL-006: Upload Supporting Documents' from dropdown and click 'Check Backlog Overlap'] </w:t>
             </w:r>
             <w:r>
               <w:rPr>
@@ -1128,7 +1128,7 @@
                 <w:color w:val="1E1E1E"/>
                 <w:sz w:val="21"/>
               </w:rPr>
-              <w:t xml:space="preserve"> against existing backlog stories and identifies it as a SUBSET of story BL-001 with high confidence, recommending a merge.</w:t>
+              <w:t>, the engine compares semantic overlap against the database and identifies it as an exact DUPLICATE with 100% confidence, recommending that the duplicate be archived or discarded.</w:t>
             </w:r>
           </w:p>
           <w:p>

</xml_diff>

<commit_message>
fix(ui): resolve UNIQUE constraint on drafts.id in Tab 7 by generating unique draft ID if DFT-001 exists
</commit_message>
<xml_diff>
--- a/PO_Backlog_Architect_Demo_Presentation_Script.docx
+++ b/PO_Backlog_Architect_Demo_Presentation_Script.docx
@@ -1376,7 +1376,7 @@
             <w:r>
               <w:drawing>
                 <wp:inline xmlns:a="http://schemas.openxmlformats.org/drawingml/2006/main" xmlns:pic="http://schemas.openxmlformats.org/drawingml/2006/picture">
-                  <wp:extent cx="5486400" cy="2603182"/>
+                  <wp:extent cx="5486400" cy="2606040"/>
                   <wp:docPr id="5" name="Picture 5"/>
                   <wp:cNvGraphicFramePr>
                     <a:graphicFrameLocks noChangeAspect="1"/>
@@ -1397,7 +1397,7 @@
                         <pic:spPr>
                           <a:xfrm>
                             <a:off x="0" y="0"/>
-                            <a:ext cx="5486400" cy="2603182"/>
+                            <a:ext cx="5486400" cy="2606040"/>
                           </a:xfrm>
                           <a:prstGeom prst="rect"/>
                         </pic:spPr>

</xml_diff>